<commit_message>
Add cover letter; finalize manuscript with Zenodo DOI/GitHub self-references
</commit_message>
<xml_diff>
--- a/manuscript/LTD_Menopause_Neurodegeneration_NBR.docx
+++ b/manuscript/LTD_Menopause_Neurodegeneration_NBR.docx
@@ -2840,9 +2840,7 @@
       </w:r>
     </w:p>
     <w:p>
-      <w:r>
-        <w:t>The conceptual-framework figures (Figures 1-3) and the structured evidence tables (Tables 1-2) are provided as open-source Python (Matplotlib/pandas) at {GITHUB_URL} (MIT license) and archived with a permanent DOI on Zenodo: {CODE_DOI_URL}. The manuscript itself is additionally archived on Zenodo: {PAPER_DOI_URL}. This is a conceptual/theoretical review; no new clinical or preclinical data were generated.</w:t>
-      </w:r>
+      <w:r/>
     </w:p>
     <w:sectPr>
       <w:pgSz w:w="12240" w:h="15840" w:orient="portrait"/>

</xml_diff>

<commit_message>
Fix empty Data and Code Availability paragraph (run-removal ordering bug); clean up DOI self-reference wording
</commit_message>
<xml_diff>
--- a/manuscript/LTD_Menopause_Neurodegeneration_NBR.docx
+++ b/manuscript/LTD_Menopause_Neurodegeneration_NBR.docx
@@ -2840,7 +2840,9 @@
       </w:r>
     </w:p>
     <w:p>
-      <w:r/>
+      <w:r>
+        <w:t>The conceptual-framework figures (Figures 1-3) and the structured evidence tables (Tables 1-2) are provided as open-source Python (Matplotlib/pandas) at https://github.com/sandlerleon/menopause-proteoform-synaptic-metaplasticity (MIT license) and archived with a permanent DOI on Zenodo: https://doi.org/10.5281/zenodo.22421311. The manuscript itself is additionally archived on Zenodo: https://doi.org/10.5281/zenodo.22421316. This is a conceptual/theoretical review; no new clinical or preclinical data were generated.</w:t>
+      </w:r>
     </w:p>
     <w:sectPr>
       <w:pgSz w:w="12240" w:h="15840" w:orient="portrait"/>

</xml_diff>

<commit_message>
Revise per 2nd-round pre-submission feedback: new question-based title, trimmed <=250-word abstract, Literature Scope and Approach section, central-hypothesis callout, What This Review Does Not Claim, trimmed peripheral-sink section, new Practical Implications section, standardized 9 references
</commit_message>
<xml_diff>
--- a/manuscript/LTD_Menopause_Neurodegeneration_NBR.docx
+++ b/manuscript/LTD_Menopause_Neurodegeneration_NBR.docx
@@ -7,29 +7,132 @@
         <w:spacing w:after="100"/>
       </w:pPr>
       <w:r>
+        <w:t>Does Endocrine State Gate Proteoform-Induced Synaptic Vulnerability? A Metaplasticity Framework for Menopause and Early Neurodegeneration</w:t>
+      </w:r>
+    </w:p>
+    <w:p>
+      <w:pPr>
+        <w:spacing w:after="200"/>
+      </w:pPr>
+      <w:r>
+        <w:t>Leon Sandler</w:t>
+      </w:r>
+    </w:p>
+    <w:p>
+      <w:pPr>
+        <w:spacing w:after="200"/>
+      </w:pPr>
+      <w:r>
+        <w:t>Independent Researcher • sandler.leon@gmail.com • Northbrook, Illinois, USA</w:t>
+      </w:r>
+    </w:p>
+    <w:p>
+      <w:pPr>
+        <w:pStyle w:val="Heading1"/>
+        <w:spacing w:after="150" w:before="300"/>
+      </w:pPr>
+      <w:r>
+        <w:t xml:space="preserve">Highlights</w:t>
+      </w:r>
+    </w:p>
+    <w:p>
+      <w:pPr>
+        <w:spacing w:after="200"/>
+      </w:pPr>
+      <w:r>
+        <w:t xml:space="preserve">• Synthesizes the menopause/neuroendocrine and Aβ/tau synaptotoxicity literatures around a shared synaptic mechanism.</w:t>
+      </w:r>
+    </w:p>
+    <w:p>
+      <w:pPr>
+        <w:spacing w:after="200"/>
+      </w:pPr>
+      <w:r>
+        <w:t xml:space="preserve">• Proposes that endocrine state and soluble proteoform burden may jointly regulate synaptic metaplasticity.</w:t>
+      </w:r>
+    </w:p>
+    <w:p>
+      <w:pPr>
+        <w:spacing w:after="200"/>
+      </w:pPr>
+      <w:r>
+        <w:t xml:space="preserve">• Explicitly distinguishes mood symptoms, cognitive complaints, and Alzheimer's pathophysiology as separate entities.</w:t>
+      </w:r>
+    </w:p>
+    <w:p>
+      <w:pPr>
+        <w:spacing w:after="200"/>
+      </w:pPr>
+      <w:r>
+        <w:t xml:space="preserve">• Presents five competing explanatory models and a full falsifiable research agenda.</w:t>
+      </w:r>
+    </w:p>
+    <w:p>
+      <w:pPr>
+        <w:spacing w:after="200"/>
+      </w:pPr>
+      <w:r>
+        <w:t xml:space="preserve">• Evaluates peripheral, non-BBB-penetrating proteoform clearance as one, not the sole, downstream implication.</w:t>
+      </w:r>
+    </w:p>
+    <w:p>
+      <w:pPr>
+        <w:pStyle w:val="Heading1"/>
+        <w:spacing w:after="150" w:before="300"/>
+      </w:pPr>
+      <w:r>
+        <w:t xml:space="preserve">Ethical Statement</w:t>
+      </w:r>
+    </w:p>
+    <w:p>
+      <w:pPr>
+        <w:spacing w:after="200"/>
+      </w:pPr>
+      <w:r>
+        <w:rPr>
+          <w:i/>
+          <w:iCs/>
+        </w:rPr>
+        <w:t xml:space="preserve">This paper is a theoretical/conceptual review synthesizing existing literature. It does not report new clinical or preclinical data, does not propose or endorse any unproven treatment, and nothing in it should be read as clinical guidance for menopausal mood symptoms, cognitive complaints, or Alzheimer's disease. Systemic hormone therapy, neurosteroid GABA-A modulators, and peripheral anti-amyloid immunotherapy each carry distinct, well-documented risks and an evolving, sometimes contradictory evidence base (Section 3.3) that is outside the scope of this review and must be independently evaluated by qualified clinicians for any individual patient. This framework identifies a proposed experimental interaction that could eventually motivate biomarker-stratified mechanistic studies; it does not establish, and should not be read as establishing, an indication for anti-amyloid therapy, hormone therapy, or any other intervention in perimenopausal mood or cognitive symptoms. This paper's contribution is to motivate hypothesis-driven mechanistic research.</w:t>
+      </w:r>
+    </w:p>
+    <w:p>
+      <w:pPr>
+        <w:pStyle w:val="Heading1"/>
+        <w:spacing w:after="150" w:before="300"/>
+      </w:pPr>
+      <w:r>
+        <w:t xml:space="preserve">Abstract</w:t>
+      </w:r>
+    </w:p>
+    <w:p>
+      <w:pPr>
+        <w:spacing w:after="200"/>
+      </w:pPr>
+      <w:r>
+        <w:t>This is a hypothesis-driven conceptual review, not a systematic review or meta-analysis, integrating two largely independent bodies of neuroscience literature — the neuroendocrinology of the menopause transition and the molecular synaptotoxicity of soluble amyloid-β (Aβ) oligomers — to ask whether they converge on a shared synaptic mechanism. Estrogen (17β-estradiol) and the neurosteroid allopregnanolone regulate hippocampal excitatory-inhibitory balance through ERβ, GPER1, and GABA-A δ-subunit-containing receptors, though not uniformly “anti-LTD”: GPER1 mediates its own distinct form of hippocampal long-term depression (LTD). Separately, soluble, pre-plaque Aβ oligomers facilitate NMDA-receptor- and mGluR1-dependent hippocampal LTD via convergent calcineurin/AKAP150 spine-elimination signaling, independent of amyloid plaque. We situate both literatures within Bienenstock-Cooper-Munro (BCM) metaplasticity theory, in which a sliding modification threshold, not a fixed switch, governs whether a synaptic input produces potentiation or depression.</w:t>
+      </w:r>
+    </w:p>
+    <w:p>
+      <w:pPr>
+        <w:spacing w:after="200"/>
+      </w:pPr>
+      <w:r>
+        <w:t>We propose a specific, falsifiable hypothesis: that declining estrogen/allopregnanolone tone and rising proteoform burden act on convergent postsynaptic machinery to jointly lower this threshold in hippocampal and limbic circuits. We explicitly distinguish this synaptic-level claim from the clinically separate phenomena of perimenopausal mood symptoms, subjective cognitive complaints, mild cognitive impairment, and Alzheimer's disease, and weigh it against four competing models, including the possibility that endocrine decline and proteinopathy are both downstream of a shared upstream process. We present a structured, falsifiable research agenda specifying the experiments needed to confirm, partially confirm, or refute the proposed convergence. We do not claim the central hypothesis is established; our contribution is making an underexplored cross-disciplinary link explicit and testable.</w:t>
+      </w:r>
+    </w:p>
+    <w:p>
+      <w:pPr>
+        <w:spacing w:after="200"/>
+      </w:pPr>
+      <w:r>
         <w:rPr>
           <w:b/>
           <w:bCs/>
-          <w:sz w:val="30"/>
-          <w:szCs w:val="30"/>
-        </w:rPr>
-        <w:t xml:space="preserve">Endocrine State and Soluble Proteoforms as Convergent Regulators of Synaptic Plasticity: Implications for Menopause and Early Neurodegeneration</w:t>
-      </w:r>
-    </w:p>
-    <w:p>
-      <w:pPr>
-        <w:spacing w:after="200"/>
-      </w:pPr>
-      <w:r>
-        <w:t>Leon Sandler</w:t>
-      </w:r>
-    </w:p>
-    <w:p>
-      <w:pPr>
-        <w:spacing w:after="200"/>
-      </w:pPr>
-      <w:r>
-        <w:t>Independent Researcher • sandler.leon@gmail.com • Northbrook, Illinois, USA</w:t>
+          <w:sz w:val="20"/>
+          <w:szCs w:val="20"/>
+        </w:rPr>
+        <w:t xml:space="preserve">Keywords: long-term depression, synaptic metaplasticity, BCM theory, estrogen, allopregnanolone, GABA-A receptor, amyloid-beta oligomers, perimenopausal depression, peripheral sink hypothesis, NMDA receptor, GPER1, hippocampus, sex differences, Alzheimer's disease, neuroendocrinology</w:t>
       </w:r>
     </w:p>
     <w:p>
@@ -38,119 +141,6 @@
         <w:spacing w:after="150" w:before="300"/>
       </w:pPr>
       <w:r>
-        <w:t xml:space="preserve">Highlights</w:t>
-      </w:r>
-    </w:p>
-    <w:p>
-      <w:pPr>
-        <w:spacing w:after="200"/>
-      </w:pPr>
-      <w:r>
-        <w:t xml:space="preserve">• Synthesizes the menopause/neuroendocrine and Aβ/tau synaptotoxicity literatures around a shared synaptic mechanism.</w:t>
-      </w:r>
-    </w:p>
-    <w:p>
-      <w:pPr>
-        <w:spacing w:after="200"/>
-      </w:pPr>
-      <w:r>
-        <w:t xml:space="preserve">• Proposes that endocrine state and soluble proteoform burden may jointly regulate synaptic metaplasticity.</w:t>
-      </w:r>
-    </w:p>
-    <w:p>
-      <w:pPr>
-        <w:spacing w:after="200"/>
-      </w:pPr>
-      <w:r>
-        <w:t xml:space="preserve">• Explicitly distinguishes mood symptoms, cognitive complaints, and Alzheimer's pathophysiology as separate entities.</w:t>
-      </w:r>
-    </w:p>
-    <w:p>
-      <w:pPr>
-        <w:spacing w:after="200"/>
-      </w:pPr>
-      <w:r>
-        <w:t xml:space="preserve">• Presents five competing explanatory models and a full falsifiable research agenda.</w:t>
-      </w:r>
-    </w:p>
-    <w:p>
-      <w:pPr>
-        <w:spacing w:after="200"/>
-      </w:pPr>
-      <w:r>
-        <w:t xml:space="preserve">• Evaluates peripheral, non-BBB-penetrating proteoform clearance as one, not the sole, downstream implication.</w:t>
-      </w:r>
-    </w:p>
-    <w:p>
-      <w:pPr>
-        <w:pStyle w:val="Heading1"/>
-        <w:spacing w:after="150" w:before="300"/>
-      </w:pPr>
-      <w:r>
-        <w:t xml:space="preserve">Ethical Statement</w:t>
-      </w:r>
-    </w:p>
-    <w:p>
-      <w:pPr>
-        <w:spacing w:after="200"/>
-      </w:pPr>
-      <w:r>
-        <w:rPr>
-          <w:i/>
-          <w:iCs/>
-        </w:rPr>
-        <w:t xml:space="preserve">This paper is a theoretical/conceptual review synthesizing existing literature. It does not report new clinical or preclinical data, does not propose or endorse any unproven treatment, and nothing in it should be read as clinical guidance for menopausal mood symptoms, cognitive complaints, or Alzheimer's disease. Systemic hormone therapy, neurosteroid GABA-A modulators, and peripheral anti-amyloid immunotherapy each carry distinct, well-documented risks and an evolving, sometimes contradictory evidence base (Section 3.3) that is outside the scope of this review and must be independently evaluated by qualified clinicians for any individual patient. This framework identifies a proposed experimental interaction that could eventually motivate biomarker-stratified mechanistic studies; it does not establish, and should not be read as establishing, an indication for anti-amyloid therapy, hormone therapy, or any other intervention in perimenopausal mood or cognitive symptoms. This paper's contribution is to motivate hypothesis-driven mechanistic research.</w:t>
-      </w:r>
-    </w:p>
-    <w:p>
-      <w:pPr>
-        <w:pStyle w:val="Heading1"/>
-        <w:spacing w:after="150" w:before="300"/>
-      </w:pPr>
-      <w:r>
-        <w:t xml:space="preserve">Abstract</w:t>
-      </w:r>
-    </w:p>
-    <w:p>
-      <w:pPr>
-        <w:spacing w:after="200"/>
-      </w:pPr>
-      <w:r>
-        <w:t xml:space="preserve">Long-term depression (LTD), a normal activity-dependent form of synaptic weakening, and clinical depression/cognitive decline are studied in almost entirely separate literatures, connected only by overlapping terminology. This review synthesizes evidence from two such literatures — neuroendocrinology of the menopause transition and molecular synaptotoxicity of soluble amyloid-β (Aβ) oligomers — to ask whether they converge on a shared synaptic mechanism. We first review the receptor-level evidence that estrogen (17β-estradiol) and the neurosteroid allopregnanolone regulate hippocampal excitatory-inhibitory balance through ERβ, GPER1, and GABA-A δ-subunit-containing receptors, emphasizing that these effects are not uniformly "anti-LTD": GPER1, notably, mediates its own distinct form of hippocampal LTD. We then review the well-established evidence that soluble, pre-plaque Aβ oligomers facilitate NMDA-receptor- and mGluR1-dependent hippocampal LTD via convergent calcineurin/AKAP150 spine-elimination signaling, independent of amyloid plaque. We situate both literatures within Bienenstock-Cooper-Munro (BCM) metaplasticity theory, in which a sliding modification threshold — rather than a fixed switch — governs whether a given synaptic input produces potentiation or depression, offering a formal vocabulary for how two independent biological inputs (endocrine state, proteoform burden) could shift the same threshold.</w:t>
-      </w:r>
-    </w:p>
-    <w:p>
-      <w:pPr>
-        <w:spacing w:after="200"/>
-      </w:pPr>
-      <w:r>
-        <w:rPr>
-          <w:sz w:val="21"/>
-          <w:szCs w:val="21"/>
-        </w:rPr>
-        <w:t xml:space="preserve">We synthesize this evidence into a specific, falsifiable hypothesis: that declining estrogen/allopregnanolone tone and rising soluble proteoform burden act on convergent postsynaptic machinery to jointly lower the threshold for pathologically facilitated synaptic weakening in hippocampal and limbic circuits. We explicitly distinguish this synaptic-level claim from the clinically distinct phenomena of perimenopausal mood symptoms, subjective cognitive complaints, objective mild cognitive impairment, and diagnosed Alzheimer's disease, cautioning against collapsing these entities. We review competing and complementary explanatory models, including the possibility that both endocrine decline and proteinopathy are downstream consequences of a shared upstream process (aging, neuroinflammation, or vascular dysfunction) rather than directly interacting. We present a structured, falsifiable research agenda — not a treatment proposal — specifying the experiments needed to confirm, partially confirm, or refute the proposed convergence, and only secondarily note that, if confirmed, this convergence would motivate evaluating combined endocrine and peripheral proteoform-targeting strategies as one among several possible downstream translational directions. We do not claim the central convergence hypothesis is established; the review's contribution is to make an underexplored cross-disciplinary link explicit, evidence-weighted, and testable.</w:t>
-      </w:r>
-    </w:p>
-    <w:p>
-      <w:pPr>
-        <w:spacing w:after="200"/>
-      </w:pPr>
-      <w:r>
-        <w:rPr>
-          <w:b/>
-          <w:bCs/>
-          <w:sz w:val="20"/>
-          <w:szCs w:val="20"/>
-        </w:rPr>
-        <w:t xml:space="preserve">Keywords: long-term depression, synaptic metaplasticity, BCM theory, estrogen, allopregnanolone, GABA-A receptor, amyloid-beta oligomers, perimenopausal depression, peripheral sink hypothesis, NMDA receptor, GPER1, hippocampus, sex differences, Alzheimer's disease, neuroendocrinology</w:t>
-      </w:r>
-    </w:p>
-    <w:p>
-      <w:pPr>
-        <w:pStyle w:val="Heading1"/>
-        <w:spacing w:after="150" w:before="300"/>
-      </w:pPr>
-      <w:r>
         <w:t xml:space="preserve">1. Introduction</w:t>
       </w:r>
     </w:p>
@@ -194,6 +184,39 @@
       </w:pPr>
       <w:r>
         <w:t xml:space="preserve">This review asks whether these two literatures describe a shared underlying vulnerability at the level of synaptic plasticity regulation, rather than assuming they do. We organize the review around five evidence domains — synaptic metaplasticity theory (Section 2), endocrine regulation of plasticity (Section 3), soluble proteoform synaptotoxicity (Section 4), the proposed point of convergence and competing explanatory models (Section 5), and clinical entity boundaries and translational implications (Sections 6–8) — before presenting a structured falsifiability and research agenda (Section 9).</w:t>
+      </w:r>
+    </w:p>
+    <w:p>
+      <w:pPr>
+        <w:pStyle w:val="Heading2"/>
+      </w:pPr>
+      <w:r>
+        <w:rPr>
+          <w:b w:val="0"/>
+          <w:i w:val="0"/>
+        </w:rPr>
+        <w:t>1.3 Literature Scope and Approach</w:t>
+      </w:r>
+    </w:p>
+    <w:p>
+      <w:r>
+        <w:rPr>
+          <w:b w:val="0"/>
+          <w:i w:val="0"/>
+        </w:rPr>
+        <w:t>This article is a hypothesis-driven conceptual review rather than a systematic review or meta-analysis. The literature was selected to evaluate the mechanistic plausibility of a specific proposed convergence between endocrine regulation of synaptic plasticity and soluble proteoform-mediated synaptotoxicity. Priority was given to primary experimental studies, randomized clinical trials, major meta-analyses, and recent mechanistic reviews relevant to five domains: (1) synaptic metaplasticity and BCM theory; (2) estrogen and neurosteroid regulation of hippocampal plasticity; (3) soluble Aβ oligomer-mediated synaptotoxicity; (4) sex differences and menopause-related vulnerability in Alzheimer's disease; and (5) competing mechanistic explanations. This review does not claim systematic or exhaustive coverage of all literature within these fields.</w:t>
+      </w:r>
+    </w:p>
+    <w:p>
+      <w:pPr>
+        <w:jc w:val="center"/>
+      </w:pPr>
+      <w:r>
+        <w:rPr>
+          <w:b w:val="0"/>
+          <w:i/>
+        </w:rPr>
+        <w:t>Central question addressed by this review: does endocrine state alter susceptibility to proteoform-driven synaptic metaplasticity? Sections 2–4 review the receptor-level evidence supporting each half of this question; Section 5 develops the convergence hypothesis and weighs it against four competing models; Table 1 separates what is independently established from what remains proposed; Section 9 specifies the experiments that could confirm or refute it.</w:t>
       </w:r>
     </w:p>
     <w:p>
@@ -1417,6 +1440,63 @@
     </w:p>
     <w:p>
       <w:pPr>
+        <w:pStyle w:val="Heading2"/>
+      </w:pPr>
+      <w:r>
+        <w:rPr>
+          <w:b w:val="0"/>
+          <w:i w:val="0"/>
+        </w:rPr>
+        <w:t>What This Review Does Not Claim</w:t>
+      </w:r>
+    </w:p>
+    <w:p>
+      <w:r>
+        <w:rPr>
+          <w:b w:val="0"/>
+          <w:i w:val="0"/>
+        </w:rPr>
+        <w:t>• That perimenopausal depression is an early stage of Alzheimer's disease.</w:t>
+      </w:r>
+    </w:p>
+    <w:p>
+      <w:r>
+        <w:rPr>
+          <w:b w:val="0"/>
+          <w:i w:val="0"/>
+        </w:rPr>
+        <w:t>• That most women with perimenopausal mood symptoms have elevated soluble proteoform burden.</w:t>
+      </w:r>
+    </w:p>
+    <w:p>
+      <w:r>
+        <w:rPr>
+          <w:b w:val="0"/>
+          <w:i w:val="0"/>
+        </w:rPr>
+        <w:t>• That the central convergence hypothesis (Model 5, Section 5.2) has been directly tested or established in any experimental system.</w:t>
+      </w:r>
+    </w:p>
+    <w:p>
+      <w:r>
+        <w:rPr>
+          <w:b w:val="0"/>
+          <w:i w:val="0"/>
+        </w:rPr>
+        <w:t>• That hormone therapy, anti-amyloid therapy, or any other intervention is indicated for perimenopausal mood or cognitive symptoms on the basis of this framework (Section 7.3).</w:t>
+      </w:r>
+    </w:p>
+    <w:p>
+      <w:r>
+        <w:rPr>
+          <w:b w:val="0"/>
+          <w:i w:val="0"/>
+        </w:rPr>
+        <w:t>• That this review constitutes a systematic review or exhaustive coverage of any single domain it touches (Section 1.3).</w:t>
+      </w:r>
+    </w:p>
+    <w:p>
+      <w:pPr>
         <w:pStyle w:val="Heading1"/>
         <w:spacing w:after="150" w:before="300"/>
       </w:pPr>
@@ -1455,7 +1535,7 @@
         <w:spacing w:after="200"/>
       </w:pPr>
       <w:r>
-        <w:t xml:space="preserve">If Section 5's convergence hypothesis were confirmed, one — not the only — downstream translational direction would be evaluating whether addressing soluble proteoform burden through a peripherally restricted mechanism, rather than a directly CNS-penetrant one, could reduce the ARIA-type risk profile associated with existing anti-amyloid therapy while still addressing one arm of the proposed convergent pathway. A peripherally restricted mechanism — in which circulating antibodies sequester soluble Aβ in blood, establishing a concentration gradient that draws oligomeric species out of the CNS via efflux transporters without requiring antibody entry into the brain — has experimental precedent independent of the present hypothesis [52,53], though the mechanism remains actively contested: it depends on intact efflux transport (e.g., LRP1) [52,54], its evidence base concerns Aβ clearance broadly rather than the specific synaptotoxic oligomer species implicated in Section 4.1, and it does not resolve whether lowering plasma Aβ concentration necessarily lowers the CNS oligomer pool most relevant to LTD facilitation. Any implementation via active immunization would additionally inherit the safety architecture required to avoid the T-cell-mediated meningoencephalitis signal associated with the first-generation AN1792 vaccine [55,56], and would require epitope-restricted design of the kind validated in later-generation candidates [57]. We present this as an illustrative example of a downstream research direction, not a validated or proposed treatment, and we emphasize per Section 6 that it would not be indicated for perimenopausal mood symptoms in the absence of independently confirmed proteoform burden.</w:t>
+        <w:t>If Section 5's convergence hypothesis were confirmed, one — not the only — downstream direction would be evaluating whether a peripherally restricted proteoform-clearance mechanism, rather than a directly CNS-penetrant one, could address one arm of the convergent pathway while reducing the ARIA-type risk of existing anti-amyloid therapy. Such mechanisms, in which circulating antibodies sequester soluble Aβ in blood and draw oligomeric species out of the CNS via efflux transporters, have experimental precedent [52,53] but remain contested: they depend on intact efflux transport (e.g., LRP1) [52,54], their evidence concerns Aβ clearance broadly rather than the specific synaptotoxic species in Section 4.1, and active-immunization implementations would inherit the safety requirements established after the AN1792 meningoencephalitis signal [55,56], addressed in later epitope-restricted candidates [57]. We present this as one illustrative downstream research direction, not a validated or proposed treatment, and reiterate per Section 6 that it would not be indicated for perimenopausal mood symptoms absent independently confirmed proteoform burden.</w:t>
       </w:r>
     </w:p>
     <w:p>
@@ -1473,6 +1553,45 @@
       </w:pPr>
       <w:r>
         <w:t xml:space="preserve">To state plainly what Sections 6-7 imply: this review does not support, and should not be cited in support of, treating women with perimenopausal depression with anti-amyloid therapy, hormone therapy specifically for cognitive protection (given Section 3.3's largely null RCT record), or any other intervention on the basis of the convergence hypothesis alone. The proposed framework identifies an experimental interaction that could eventually motivate biomarker-stratified mechanistic studies in appropriately selected, consenting research populations; it does not establish a clinical indication for any therapy in any population.</w:t>
+      </w:r>
+    </w:p>
+    <w:p>
+      <w:pPr>
+        <w:pStyle w:val="Heading2"/>
+      </w:pPr>
+      <w:r>
+        <w:rPr>
+          <w:b w:val="0"/>
+          <w:i w:val="0"/>
+        </w:rPr>
+        <w:t>7.4 Practical Implications, If Confirmed</w:t>
+      </w:r>
+    </w:p>
+    <w:p>
+      <w:r>
+        <w:rPr>
+          <w:b w:val="0"/>
+          <w:i w:val="0"/>
+        </w:rPr>
+        <w:t>If the central convergence hypothesis were confirmed, its practical significance would extend beyond mechanism. Clinically, a validated endocrine-by-proteoform interaction would reframe episodes of “brain fog,” mood change, or memory difficulty during major hormonal transitions (chronic stress, pregnancy, the postpartum period, menopause, thyroid disease) as reflecting a measurable shift in synaptic metaplasticity threshold rather than a purely psychological or purely metabolic phenomenon — a mechanistic account for a class of symptoms current diagnostics do not capture.</w:t>
+      </w:r>
+    </w:p>
+    <w:p>
+      <w:r>
+        <w:rPr>
+          <w:b w:val="0"/>
+          <w:i w:val="0"/>
+        </w:rPr>
+        <w:t>It would also motivate biomarker-stratified approaches that current single-target treatments do not offer: pairing hormone panels with proteoform measurements (blood or CSF) could, in principle, help identify patients approaching a vulnerable threshold before cognitive symptoms become apparent, and could help explain why an intervention effective in one hormonal state fails in another. We emphasize that no such biomarker or stratification strategy currently exists or is validated; this is a research direction the confirmed hypothesis would motivate, not a clinical tool available today (Section 7.3).</w:t>
+      </w:r>
+    </w:p>
+    <w:p>
+      <w:r>
+        <w:rPr>
+          <w:b w:val="0"/>
+          <w:i w:val="0"/>
+        </w:rPr>
+        <w:t>A further, more speculative implication concerns the timing of cognitively demanding activity relative to known hormonal or metabolic rhythms (e.g., circadian cortisol, postprandial insulin, menstrual-cycle phase); if endocrine state measurably shifts the metaplasticity threshold, this could eventually inform the scheduling of learning or cognitive-rehabilitation tasks, though this extension is presently speculative and outside the scope of the falsifiable predictions in Section 9.</w:t>
       </w:r>
     </w:p>
     <w:p>
@@ -2303,47 +2422,31 @@
         <w:spacing w:after="120"/>
       </w:pPr>
       <w:r>
-        <w:rPr>
-          <w:sz w:val="20"/>
-          <w:szCs w:val="20"/>
-        </w:rPr>
-        <w:t xml:space="preserve">[14] Kumar, A., et al. G protein-coupled estrogen receptor: rapid effects on hippocampal-dependent spatial memory and synaptic plasticity. Frontiers in Neuroscience (review), PMC7298106.</w:t>
-      </w:r>
-    </w:p>
-    <w:p>
-      <w:pPr>
-        <w:spacing w:after="120"/>
-      </w:pPr>
-      <w:r>
-        <w:rPr>
-          <w:sz w:val="20"/>
-          <w:szCs w:val="20"/>
-        </w:rPr>
-        <w:t xml:space="preserve">[15] Srivastava, D.P., Woolfrey, K.M., Jones, K.A., et al. (2010). Rapid modulation of synaptogenesis and spinogenesis by 17β-estradiol in primary cortical neurons. PMC4396386.</w:t>
-      </w:r>
-    </w:p>
-    <w:p>
-      <w:pPr>
-        <w:spacing w:after="120"/>
-      </w:pPr>
-      <w:r>
-        <w:rPr>
-          <w:sz w:val="20"/>
-          <w:szCs w:val="20"/>
-        </w:rPr>
-        <w:t xml:space="preserve">[16] Gross, K.S., Alderman, Z., Merrill, D., et al. G-protein coupled estrogen receptor (GPER1) activation promotes synaptic insertion of AMPA receptors and induction of chemical LTP at hippocampal temporoammonic-CA1 synapses. PMC9883958.</w:t>
-      </w:r>
-    </w:p>
-    <w:p>
-      <w:pPr>
-        <w:spacing w:after="120"/>
-      </w:pPr>
-      <w:r>
-        <w:rPr>
-          <w:sz w:val="20"/>
-          <w:szCs w:val="20"/>
-        </w:rPr>
-        <w:t xml:space="preserve">[17] Tabatadze, N., et al. (2024). 17β-estradiol reduces inhibitory synaptic currents in entorhinal cortex neurons through GPER1 activation of extracellular signal-regulated kinase. Hippocampus.</w:t>
+        <w:t>[14] Kumar, A., &amp; Foster, T.C. (2020). G protein-coupled estrogen receptor: rapid effects on hippocampal-dependent spatial memory and synaptic plasticity. Frontiers in Endocrinology, 11, 385.</w:t>
+      </w:r>
+    </w:p>
+    <w:p>
+      <w:pPr>
+        <w:spacing w:after="120"/>
+      </w:pPr>
+      <w:r>
+        <w:t>[15] Sellers, K.J., Erli, F., Raval, P., Watson, I.A., Chen, D., &amp; Srivastava, D.P. (2015). Rapid modulation of synaptogenesis and spinogenesis by 17β-estradiol in primary cortical neurons. Frontiers in Cellular Neuroscience, 9, 137.</w:t>
+      </w:r>
+    </w:p>
+    <w:p>
+      <w:pPr>
+        <w:spacing w:after="120"/>
+      </w:pPr>
+      <w:r>
+        <w:t>[16] Clements, L., Alexander, A., Hamilton, K., Irving, A., &amp; Harvey, J. (2023). G-protein coupled estrogen receptor (GPER1) activation promotes synaptic insertion of AMPA receptors and induction of chemical LTP at hippocampal temporoammonic-CA1 synapses. Molecular Brain, 16, 9.</w:t>
+      </w:r>
+    </w:p>
+    <w:p>
+      <w:pPr>
+        <w:spacing w:after="120"/>
+      </w:pPr>
+      <w:r>
+        <w:t>[17] Tabatadze, N., et al. (2024). 17β-estradiol reduces inhibitory synaptic currents in entorhinal cortex neurons through GPER1 activation of extracellular signal-regulated kinase. Hippocampus, 34(9), 454–463.</w:t>
       </w:r>
     </w:p>
     <w:p>
@@ -2447,11 +2550,7 @@
         <w:spacing w:after="120"/>
       </w:pPr>
       <w:r>
-        <w:rPr>
-          <w:sz w:val="20"/>
-          <w:szCs w:val="20"/>
-        </w:rPr>
-        <w:t xml:space="preserve">[26] Fisher, D.W., Bennett, D.A., &amp; Dong, H. (2018/2023 update). Sex and gender differences in Alzheimer's disease risk. Frontiers in Global Women's Health / PMC10796575.</w:t>
+        <w:t>[26] O'Neal, M.A. (2024). Women and the risk of Alzheimer's disease. Frontiers in Global Women's Health, 4, 1324522.</w:t>
       </w:r>
     </w:p>
     <w:p>
@@ -2483,23 +2582,15 @@
         <w:spacing w:after="120"/>
       </w:pPr>
       <w:r>
-        <w:rPr>
-          <w:sz w:val="20"/>
-          <w:szCs w:val="20"/>
-        </w:rPr>
-        <w:t xml:space="preserve">[29] Sex-dependent effect of APOE on Alzheimer's disease and other age-related neurodegenerative disorders. (2020). Disease Models &amp; Mechanisms, 13(8), dmm045211.</w:t>
-      </w:r>
-    </w:p>
-    <w:p>
-      <w:pPr>
-        <w:spacing w:after="120"/>
-      </w:pPr>
-      <w:r>
-        <w:rPr>
-          <w:sz w:val="20"/>
-          <w:szCs w:val="20"/>
-        </w:rPr>
-        <w:t xml:space="preserve">[30] Shi, Z., Wu, L., &amp; Zhang, C. (2025). Testosterone as a mediator of APOE4-linked sex differences in Alzheimer's disease. [Review].</w:t>
+        <w:t>[29] Gamache, J., Yun, Y., &amp; Chiba-Falek, O. (2020). Sex-dependent effect of APOE on Alzheimer's disease and other age-related neurodegenerative disorders. Disease Models &amp; Mechanisms, 13(8), dmm045211.</w:t>
+      </w:r>
+    </w:p>
+    <w:p>
+      <w:pPr>
+        <w:spacing w:after="120"/>
+      </w:pPr>
+      <w:r>
+        <w:t>[30] Shi, Z., Wu, L., Zhang, C., Zeng, X., Yao, G., He, X., Hu, J., He, L., &amp; Xie, T. (2025). Testosterone as a mediator of APOE4-linked sex differences in Alzheimer's disease. International Immunopharmacology, 166, 115588.</w:t>
       </w:r>
     </w:p>
     <w:p>
@@ -2563,11 +2654,7 @@
         <w:spacing w:after="120"/>
       </w:pPr>
       <w:r>
-        <w:rPr>
-          <w:sz w:val="20"/>
-          <w:szCs w:val="20"/>
-        </w:rPr>
-        <w:t xml:space="preserve">[36] Freeman, E.W. (2010/2015). Associations of hormones and menopausal status with depressed mood in women with no history of depression. Archives of General Psychiatry / related cohort publications.</w:t>
+        <w:t>[36] Freeman, E.W., Sammel, M.D., Lin, H., &amp; Nelson, D.B. (2006). Associations of hormones and menopausal status with depressed mood in women with no history of depression. Archives of General Psychiatry, 63(4), 375–382.</w:t>
       </w:r>
     </w:p>
     <w:p>
@@ -2659,11 +2746,7 @@
         <w:spacing w:after="120"/>
       </w:pPr>
       <w:r>
-        <w:rPr>
-          <w:sz w:val="20"/>
-          <w:szCs w:val="20"/>
-        </w:rPr>
-        <w:t xml:space="preserve">[44] Menopause hormone therapy and risk of mild cognitive impairment or dementia: a systematic review and meta-analysis. (2025). The Lancet Healthy Longevity.</w:t>
+        <w:t>[44] Melville, M., He, L., Desai, R., Nyamayaro, P., Fox, C., Kothari, K.U., Condron, P., Miao, M., Hickey, M., &amp; Spector, A. (2025). Menopause hormone therapy and risk of mild cognitive impairment or dementia: a systematic review and meta-analysis. The Lancet Healthy Longevity, 6(12), 100803.</w:t>
       </w:r>
     </w:p>
     <w:p>

</xml_diff>